<commit_message>
docs(course): add figures and numbered table captions to RSD v1.0
Co-Authored-By: Claude Opus 5.5 <noreply@anthropic.com>
</commit_message>
<xml_diff>
--- a/docs/moodle/ready-deliverables/Zindeo-RSD-1.0.docx
+++ b/docs/moodle/ready-deliverables/Zindeo-RSD-1.0.docx
@@ -1806,7 +1806,7 @@
         <w:jc w:val="both"/>
       </w:pPr>
       <w:r>
-        <w:t xml:space="preserve">Zindeo is a mobile calorie and nutrition tracking application for iOS and Android, targeting the Turkish market first. The goals of the project are:</w:t>
+        <w:t xml:space="preserve">Zindeo is a mobile calorie and nutrition tracking application for iOS and Android, targeting the Turkish market first. The goals of the project are listed in Table 1.1, and Figure 1.1 gives an overview of the system and the external services it uses.</w:t>
       </w:r>
     </w:p>
     <w:tbl>
@@ -2257,8 +2257,80 @@
     </w:tbl>
     <w:p>
       <w:pPr>
-        <w:spacing w:after="120"/>
+        <w:spacing w:after="200" w:before="80"/>
+        <w:jc w:val="center"/>
       </w:pPr>
+      <w:r>
+        <w:rPr>
+          <w:i/>
+          <w:iCs/>
+          <w:sz w:val="20"/>
+          <w:szCs w:val="20"/>
+        </w:rPr>
+        <w:t xml:space="preserve">Table 1.1. Goals of the project</w:t>
+      </w:r>
+    </w:p>
+    <w:p>
+      <w:pPr>
+        <w:keepNext/>
+        <w:spacing w:before="200"/>
+        <w:jc w:val="center"/>
+      </w:pPr>
+      <w:r>
+        <w:drawing>
+          <wp:inline distT="0" distB="0" distL="0" distR="0">
+            <wp:extent cx="6096000" cy="1695450"/>
+            <wp:effectExtent t="0" r="0" b="0" l="0"/>
+            <wp:docPr id="1" name="fig-1-1-overview.png" descr="Figure 1.1. Overview of Zindeo and the external services it uses" title="Figure 1.1. Overview of Zindeo and the external services it uses"/>
+            <wp:cNvGraphicFramePr>
+              <a:graphicFrameLocks xmlns:a="http://schemas.openxmlformats.org/drawingml/2006/main" noChangeAspect="1"/>
+            </wp:cNvGraphicFramePr>
+            <a:graphic xmlns:a="http://schemas.openxmlformats.org/drawingml/2006/main">
+              <a:graphicData uri="http://schemas.openxmlformats.org/drawingml/2006/picture">
+                <pic:pic xmlns:pic="http://schemas.openxmlformats.org/drawingml/2006/picture">
+                  <pic:nvPicPr>
+                    <pic:cNvPr id="0" name="" descr=""/>
+                    <pic:cNvPicPr>
+                      <a:picLocks noChangeAspect="1" noChangeArrowheads="1"/>
+                    </pic:cNvPicPr>
+                  </pic:nvPicPr>
+                  <pic:blipFill>
+                    <a:blip r:embed="rId9" cstate="none"/>
+                    <a:srcRect/>
+                    <a:stretch>
+                      <a:fillRect/>
+                    </a:stretch>
+                  </pic:blipFill>
+                  <pic:spPr bwMode="auto">
+                    <a:xfrm>
+                      <a:off x="0" y="0"/>
+                      <a:ext cx="6096000" cy="1695450"/>
+                    </a:xfrm>
+                    <a:prstGeom prst="rect">
+                      <a:avLst/>
+                    </a:prstGeom>
+                  </pic:spPr>
+                </pic:pic>
+              </a:graphicData>
+            </a:graphic>
+          </wp:inline>
+        </w:drawing>
+      </w:r>
+    </w:p>
+    <w:p>
+      <w:pPr>
+        <w:spacing w:after="200" w:before="80"/>
+        <w:jc w:val="center"/>
+      </w:pPr>
+      <w:r>
+        <w:rPr>
+          <w:i/>
+          <w:iCs/>
+          <w:sz w:val="20"/>
+          <w:szCs w:val="20"/>
+        </w:rPr>
+        <w:t xml:space="preserve">Figure 1.1. Overview of Zindeo and the external services it uses</w:t>
+      </w:r>
     </w:p>
     <w:p>
       <w:pPr>
@@ -2589,6 +2661,77 @@
     </w:p>
     <w:p>
       <w:pPr>
+        <w:spacing w:after="120" w:line="288"/>
+        <w:jc w:val="both"/>
+      </w:pPr>
+      <w:r>
+        <w:t xml:space="preserve">Figure 1.2 summarises this strategy: the recognition engine changes between the phases, while the confirmation step, the calorie calculation and the data collection loop stay the same.</w:t>
+      </w:r>
+    </w:p>
+    <w:p>
+      <w:pPr>
+        <w:keepNext/>
+        <w:spacing w:before="200"/>
+        <w:jc w:val="center"/>
+      </w:pPr>
+      <w:r>
+        <w:drawing>
+          <wp:inline distT="0" distB="0" distL="0" distR="0">
+            <wp:extent cx="6096000" cy="1905000"/>
+            <wp:effectExtent t="0" r="0" b="0" l="0"/>
+            <wp:docPr id="2" name="fig-1-2-two-phase.png" descr="Figure 1.2. Two-phase recognition strategy and the data collection loop" title="Figure 1.2. Two-phase recognition strategy and the data collection loop"/>
+            <wp:cNvGraphicFramePr>
+              <a:graphicFrameLocks xmlns:a="http://schemas.openxmlformats.org/drawingml/2006/main" noChangeAspect="1"/>
+            </wp:cNvGraphicFramePr>
+            <a:graphic xmlns:a="http://schemas.openxmlformats.org/drawingml/2006/main">
+              <a:graphicData uri="http://schemas.openxmlformats.org/drawingml/2006/picture">
+                <pic:pic xmlns:pic="http://schemas.openxmlformats.org/drawingml/2006/picture">
+                  <pic:nvPicPr>
+                    <pic:cNvPr id="0" name="" descr=""/>
+                    <pic:cNvPicPr>
+                      <a:picLocks noChangeAspect="1" noChangeArrowheads="1"/>
+                    </pic:cNvPicPr>
+                  </pic:nvPicPr>
+                  <pic:blipFill>
+                    <a:blip r:embed="rId10" cstate="none"/>
+                    <a:srcRect/>
+                    <a:stretch>
+                      <a:fillRect/>
+                    </a:stretch>
+                  </pic:blipFill>
+                  <pic:spPr bwMode="auto">
+                    <a:xfrm>
+                      <a:off x="0" y="0"/>
+                      <a:ext cx="6096000" cy="1905000"/>
+                    </a:xfrm>
+                    <a:prstGeom prst="rect">
+                      <a:avLst/>
+                    </a:prstGeom>
+                  </pic:spPr>
+                </pic:pic>
+              </a:graphicData>
+            </a:graphic>
+          </wp:inline>
+        </w:drawing>
+      </w:r>
+    </w:p>
+    <w:p>
+      <w:pPr>
+        <w:spacing w:after="200" w:before="80"/>
+        <w:jc w:val="center"/>
+      </w:pPr>
+      <w:r>
+        <w:rPr>
+          <w:i/>
+          <w:iCs/>
+          <w:sz w:val="20"/>
+          <w:szCs w:val="20"/>
+        </w:rPr>
+        <w:t xml:space="preserve">Figure 1.2. Two-phase recognition strategy and the data collection loop</w:t>
+      </w:r>
+    </w:p>
+    <w:p>
+      <w:pPr>
         <w:pStyle w:val="Heading1"/>
         <w:pageBreakBefore/>
       </w:pPr>
@@ -2616,6 +2759,15 @@
         <w:t xml:space="preserve">2.1. Commercial Applications</w:t>
       </w:r>
       <w:bookmarkEnd w:id="9"/>
+    </w:p>
+    <w:p>
+      <w:pPr>
+        <w:spacing w:after="120" w:line="288"/>
+        <w:jc w:val="both"/>
+      </w:pPr>
+      <w:r>
+        <w:t xml:space="preserve">Table 2.1 summarises ten applications that offer photo-based food recognition: seven global applications and three applications from Türkiye.</w:t>
+      </w:r>
     </w:p>
     <w:tbl>
       <w:tblPr>
@@ -3966,6 +4118,15 @@
       </w:r>
       <w:bookmarkEnd w:id="11"/>
     </w:p>
+    <w:p>
+      <w:pPr>
+        <w:spacing w:after="120" w:line="288"/>
+        <w:jc w:val="both"/>
+      </w:pPr>
+      <w:r>
+        <w:t xml:space="preserve">Table 2.2 matches each gap identified in the existing systems with the approach of Zindeo.</w:t>
+      </w:r>
+    </w:p>
     <w:tbl>
       <w:tblPr>
         <w:tblW w:type="dxa" w:w="9638"/>
@@ -4532,6 +4693,15 @@
         <w:t xml:space="preserve">3.4. Problems in the Current Practice</w:t>
       </w:r>
       <w:bookmarkEnd w:id="16"/>
+    </w:p>
+    <w:p>
+      <w:pPr>
+        <w:spacing w:after="120" w:line="288"/>
+        <w:jc w:val="both"/>
+      </w:pPr>
+      <w:r>
+        <w:t xml:space="preserve">Table 3.1 lists the problems observed in the current practice. Each problem is referenced in the proposed workflow below.</w:t>
+      </w:r>
     </w:p>
     <w:tbl>
       <w:tblPr>
@@ -4993,8 +5163,18 @@
     </w:tbl>
     <w:p>
       <w:pPr>
-        <w:spacing w:after="120"/>
+        <w:spacing w:after="200" w:before="80"/>
+        <w:jc w:val="center"/>
       </w:pPr>
+      <w:r>
+        <w:rPr>
+          <w:i/>
+          <w:iCs/>
+          <w:sz w:val="20"/>
+          <w:szCs w:val="20"/>
+        </w:rPr>
+        <w:t xml:space="preserve">Table 3.1. Problems in the current practice of calorie tracking</w:t>
+      </w:r>
     </w:p>
     <w:p>
       <w:pPr>
@@ -5106,6 +5286,77 @@
     </w:p>
     <w:p>
       <w:pPr>
+        <w:spacing w:after="120" w:line="288"/>
+        <w:jc w:val="both"/>
+      </w:pPr>
+      <w:r>
+        <w:t xml:space="preserve">Figure 3.1 compares the manual logging workflow with the photo logging workflow of Zindeo.</w:t>
+      </w:r>
+    </w:p>
+    <w:p>
+      <w:pPr>
+        <w:keepNext/>
+        <w:spacing w:before="200"/>
+        <w:jc w:val="center"/>
+      </w:pPr>
+      <w:r>
+        <w:drawing>
+          <wp:inline distT="0" distB="0" distL="0" distR="0">
+            <wp:extent cx="4762500" cy="6543675"/>
+            <wp:effectExtent t="0" r="0" b="0" l="0"/>
+            <wp:docPr id="3" name="fig-3-1-workflow.png" descr="Figure 3.1. (a) Manual logging in the current practice and (b) photo logging in Zindeo" title="Figure 3.1. (a) Manual logging in the current practice and (b) photo logging in Zindeo"/>
+            <wp:cNvGraphicFramePr>
+              <a:graphicFrameLocks xmlns:a="http://schemas.openxmlformats.org/drawingml/2006/main" noChangeAspect="1"/>
+            </wp:cNvGraphicFramePr>
+            <a:graphic xmlns:a="http://schemas.openxmlformats.org/drawingml/2006/main">
+              <a:graphicData uri="http://schemas.openxmlformats.org/drawingml/2006/picture">
+                <pic:pic xmlns:pic="http://schemas.openxmlformats.org/drawingml/2006/picture">
+                  <pic:nvPicPr>
+                    <pic:cNvPr id="0" name="" descr=""/>
+                    <pic:cNvPicPr>
+                      <a:picLocks noChangeAspect="1" noChangeArrowheads="1"/>
+                    </pic:cNvPicPr>
+                  </pic:nvPicPr>
+                  <pic:blipFill>
+                    <a:blip r:embed="rId11" cstate="none"/>
+                    <a:srcRect/>
+                    <a:stretch>
+                      <a:fillRect/>
+                    </a:stretch>
+                  </pic:blipFill>
+                  <pic:spPr bwMode="auto">
+                    <a:xfrm>
+                      <a:off x="0" y="0"/>
+                      <a:ext cx="4762500" cy="6543675"/>
+                    </a:xfrm>
+                    <a:prstGeom prst="rect">
+                      <a:avLst/>
+                    </a:prstGeom>
+                  </pic:spPr>
+                </pic:pic>
+              </a:graphicData>
+            </a:graphic>
+          </wp:inline>
+        </w:drawing>
+      </w:r>
+    </w:p>
+    <w:p>
+      <w:pPr>
+        <w:spacing w:after="200" w:before="80"/>
+        <w:jc w:val="center"/>
+      </w:pPr>
+      <w:r>
+        <w:rPr>
+          <w:i/>
+          <w:iCs/>
+          <w:sz w:val="20"/>
+          <w:szCs w:val="20"/>
+        </w:rPr>
+        <w:t xml:space="preserve">Figure 3.1. (a) Manual logging in the current practice and (b) photo logging in Zindeo</w:t>
+      </w:r>
+    </w:p>
+    <w:p>
+      <w:pPr>
         <w:pStyle w:val="Heading1"/>
         <w:pageBreakBefore/>
       </w:pPr>
@@ -5121,7 +5372,7 @@
         <w:jc w:val="both"/>
       </w:pPr>
       <w:r>
-        <w:t xml:space="preserve">The following actors interact with Zindeo. The use cases of each actor will be modelled in RSD Revision 2.0.</w:t>
+        <w:t xml:space="preserve">The actors that interact with Zindeo are listed in Table 4.1. The use cases of each actor will be modelled in RSD Revision 2.0.</w:t>
       </w:r>
     </w:p>
     <w:tbl>
@@ -6159,7 +6410,7 @@
         <w:jc w:val="both"/>
       </w:pPr>
       <w:r>
-        <w:t xml:space="preserve">In this document, “the system” refers to the Zindeo mobile application together with its backend.</w:t>
+        <w:t xml:space="preserve">In this document, “the system” refers to the Zindeo mobile application together with its backend. The requirements of each subsystem are listed in Tables 5.1–5.16.</w:t>
       </w:r>
     </w:p>
     <w:p>
@@ -6764,8 +7015,18 @@
     </w:tbl>
     <w:p>
       <w:pPr>
-        <w:spacing w:after="120"/>
+        <w:spacing w:after="200" w:before="80"/>
+        <w:jc w:val="center"/>
       </w:pPr>
+      <w:r>
+        <w:rPr>
+          <w:i/>
+          <w:iCs/>
+          <w:sz w:val="20"/>
+          <w:szCs w:val="20"/>
+        </w:rPr>
+        <w:t xml:space="preserve">Table 5.1. User Account Management requirements</w:t>
+      </w:r>
     </w:p>
     <w:p>
       <w:pPr>
@@ -7769,8 +8030,18 @@
     </w:tbl>
     <w:p>
       <w:pPr>
-        <w:spacing w:after="120"/>
+        <w:spacing w:after="200" w:before="80"/>
+        <w:jc w:val="center"/>
       </w:pPr>
+      <w:r>
+        <w:rPr>
+          <w:i/>
+          <w:iCs/>
+          <w:sz w:val="20"/>
+          <w:szCs w:val="20"/>
+        </w:rPr>
+        <w:t xml:space="preserve">Table 5.2. Profile and Goal Setting requirements</w:t>
+      </w:r>
     </w:p>
     <w:p>
       <w:pPr>
@@ -8534,8 +8805,18 @@
     </w:tbl>
     <w:p>
       <w:pPr>
-        <w:spacing w:after="120"/>
+        <w:spacing w:after="200" w:before="80"/>
+        <w:jc w:val="center"/>
       </w:pPr>
+      <w:r>
+        <w:rPr>
+          <w:i/>
+          <w:iCs/>
+          <w:sz w:val="20"/>
+          <w:szCs w:val="20"/>
+        </w:rPr>
+        <w:t xml:space="preserve">Table 5.3. Food Catalogue and Search requirements</w:t>
+      </w:r>
     </w:p>
     <w:p>
       <w:pPr>
@@ -9299,8 +9580,18 @@
     </w:tbl>
     <w:p>
       <w:pPr>
-        <w:spacing w:after="120"/>
+        <w:spacing w:after="200" w:before="80"/>
+        <w:jc w:val="center"/>
       </w:pPr>
+      <w:r>
+        <w:rPr>
+          <w:i/>
+          <w:iCs/>
+          <w:sz w:val="20"/>
+          <w:szCs w:val="20"/>
+        </w:rPr>
+        <w:t xml:space="preserve">Table 5.4. Meal Logging requirements</w:t>
+      </w:r>
     </w:p>
     <w:p>
       <w:pPr>
@@ -10304,8 +10595,18 @@
     </w:tbl>
     <w:p>
       <w:pPr>
-        <w:spacing w:after="120"/>
+        <w:spacing w:after="200" w:before="80"/>
+        <w:jc w:val="center"/>
       </w:pPr>
+      <w:r>
+        <w:rPr>
+          <w:i/>
+          <w:iCs/>
+          <w:sz w:val="20"/>
+          <w:szCs w:val="20"/>
+        </w:rPr>
+        <w:t xml:space="preserve">Table 5.5. Image-Based Food Recognition requirements</w:t>
+      </w:r>
     </w:p>
     <w:p>
       <w:pPr>
@@ -10316,6 +10617,77 @@
         <w:t xml:space="preserve">5.6. Portion Size Estimation</w:t>
       </w:r>
       <w:bookmarkEnd w:id="25"/>
+    </w:p>
+    <w:p>
+      <w:pPr>
+        <w:spacing w:after="120" w:line="288"/>
+        <w:jc w:val="both"/>
+      </w:pPr>
+      <w:r>
+        <w:t xml:space="preserve">Figure 5.1 shows the portion estimation method planned for Phase 2, which uses the plate as the size reference. The corresponding requirements are FR-6.3 to FR-6.6.</w:t>
+      </w:r>
+    </w:p>
+    <w:p>
+      <w:pPr>
+        <w:keepNext/>
+        <w:spacing w:before="200"/>
+        <w:jc w:val="center"/>
+      </w:pPr>
+      <w:r>
+        <w:drawing>
+          <wp:inline distT="0" distB="0" distL="0" distR="0">
+            <wp:extent cx="3810000" cy="5962650"/>
+            <wp:effectExtent t="0" r="0" b="0" l="0"/>
+            <wp:docPr id="4" name="fig-5-1-portion.png" descr="Figure 5.1. Plate-referenced portion estimation (Phase 2)" title="Figure 5.1. Plate-referenced portion estimation (Phase 2)"/>
+            <wp:cNvGraphicFramePr>
+              <a:graphicFrameLocks xmlns:a="http://schemas.openxmlformats.org/drawingml/2006/main" noChangeAspect="1"/>
+            </wp:cNvGraphicFramePr>
+            <a:graphic xmlns:a="http://schemas.openxmlformats.org/drawingml/2006/main">
+              <a:graphicData uri="http://schemas.openxmlformats.org/drawingml/2006/picture">
+                <pic:pic xmlns:pic="http://schemas.openxmlformats.org/drawingml/2006/picture">
+                  <pic:nvPicPr>
+                    <pic:cNvPr id="0" name="" descr=""/>
+                    <pic:cNvPicPr>
+                      <a:picLocks noChangeAspect="1" noChangeArrowheads="1"/>
+                    </pic:cNvPicPr>
+                  </pic:nvPicPr>
+                  <pic:blipFill>
+                    <a:blip r:embed="rId12" cstate="none"/>
+                    <a:srcRect/>
+                    <a:stretch>
+                      <a:fillRect/>
+                    </a:stretch>
+                  </pic:blipFill>
+                  <pic:spPr bwMode="auto">
+                    <a:xfrm>
+                      <a:off x="0" y="0"/>
+                      <a:ext cx="3810000" cy="5962650"/>
+                    </a:xfrm>
+                    <a:prstGeom prst="rect">
+                      <a:avLst/>
+                    </a:prstGeom>
+                  </pic:spPr>
+                </pic:pic>
+              </a:graphicData>
+            </a:graphic>
+          </wp:inline>
+        </w:drawing>
+      </w:r>
+    </w:p>
+    <w:p>
+      <w:pPr>
+        <w:spacing w:after="200" w:before="80"/>
+        <w:jc w:val="center"/>
+      </w:pPr>
+      <w:r>
+        <w:rPr>
+          <w:i/>
+          <w:iCs/>
+          <w:sz w:val="20"/>
+          <w:szCs w:val="20"/>
+        </w:rPr>
+        <w:t xml:space="preserve">Figure 5.1. Plate-referenced portion estimation (Phase 2)</w:t>
+      </w:r>
     </w:p>
     <w:tbl>
       <w:tblPr>
@@ -10909,8 +11281,18 @@
     </w:tbl>
     <w:p>
       <w:pPr>
-        <w:spacing w:after="120"/>
+        <w:spacing w:after="200" w:before="80"/>
+        <w:jc w:val="center"/>
       </w:pPr>
+      <w:r>
+        <w:rPr>
+          <w:i/>
+          <w:iCs/>
+          <w:sz w:val="20"/>
+          <w:szCs w:val="20"/>
+        </w:rPr>
+        <w:t xml:space="preserve">Table 5.6. Portion Size Estimation requirements</w:t>
+      </w:r>
     </w:p>
     <w:p>
       <w:pPr>
@@ -11194,8 +11576,18 @@
     </w:tbl>
     <w:p>
       <w:pPr>
-        <w:spacing w:after="120"/>
+        <w:spacing w:after="200" w:before="80"/>
+        <w:jc w:val="center"/>
       </w:pPr>
+      <w:r>
+        <w:rPr>
+          <w:i/>
+          <w:iCs/>
+          <w:sz w:val="20"/>
+          <w:szCs w:val="20"/>
+        </w:rPr>
+        <w:t xml:space="preserve">Table 5.7. Barcode Scanning requirements</w:t>
+      </w:r>
     </w:p>
     <w:p>
       <w:pPr>
@@ -11959,8 +12351,18 @@
     </w:tbl>
     <w:p>
       <w:pPr>
-        <w:spacing w:after="120"/>
+        <w:spacing w:after="200" w:before="80"/>
+        <w:jc w:val="center"/>
       </w:pPr>
+      <w:r>
+        <w:rPr>
+          <w:i/>
+          <w:iCs/>
+          <w:sz w:val="20"/>
+          <w:szCs w:val="20"/>
+        </w:rPr>
+        <w:t xml:space="preserve">Table 5.8. Dashboard and Progress Tracking requirements</w:t>
+      </w:r>
     </w:p>
     <w:p>
       <w:pPr>
@@ -12244,8 +12646,18 @@
     </w:tbl>
     <w:p>
       <w:pPr>
-        <w:spacing w:after="120"/>
+        <w:spacing w:after="200" w:before="80"/>
+        <w:jc w:val="center"/>
       </w:pPr>
+      <w:r>
+        <w:rPr>
+          <w:i/>
+          <w:iCs/>
+          <w:sz w:val="20"/>
+          <w:szCs w:val="20"/>
+        </w:rPr>
+        <w:t xml:space="preserve">Table 5.9. Notifications requirements</w:t>
+      </w:r>
     </w:p>
     <w:p>
       <w:pPr>
@@ -13009,8 +13421,18 @@
     </w:tbl>
     <w:p>
       <w:pPr>
-        <w:spacing w:after="120"/>
+        <w:spacing w:after="200" w:before="80"/>
+        <w:jc w:val="center"/>
       </w:pPr>
+      <w:r>
+        <w:rPr>
+          <w:i/>
+          <w:iCs/>
+          <w:sz w:val="20"/>
+          <w:szCs w:val="20"/>
+        </w:rPr>
+        <w:t xml:space="preserve">Table 5.10. Subscription and Payment requirements</w:t>
+      </w:r>
     </w:p>
     <w:p>
       <w:pPr>
@@ -13614,8 +14036,18 @@
     </w:tbl>
     <w:p>
       <w:pPr>
-        <w:spacing w:after="120"/>
+        <w:spacing w:after="200" w:before="80"/>
+        <w:jc w:val="center"/>
       </w:pPr>
+      <w:r>
+        <w:rPr>
+          <w:i/>
+          <w:iCs/>
+          <w:sz w:val="20"/>
+          <w:szCs w:val="20"/>
+        </w:rPr>
+        <w:t xml:space="preserve">Table 5.11. Privacy, Consent and Data Management requirements</w:t>
+      </w:r>
     </w:p>
     <w:p>
       <w:pPr>
@@ -14059,8 +14491,18 @@
     </w:tbl>
     <w:p>
       <w:pPr>
-        <w:spacing w:after="120"/>
+        <w:spacing w:after="200" w:before="80"/>
+        <w:jc w:val="center"/>
       </w:pPr>
+      <w:r>
+        <w:rPr>
+          <w:i/>
+          <w:iCs/>
+          <w:sz w:val="20"/>
+          <w:szCs w:val="20"/>
+        </w:rPr>
+        <w:t xml:space="preserve">Table 5.12. Settings requirements</w:t>
+      </w:r>
     </w:p>
     <w:p>
       <w:pPr>
@@ -14504,8 +14946,18 @@
     </w:tbl>
     <w:p>
       <w:pPr>
-        <w:spacing w:after="120"/>
+        <w:spacing w:after="200" w:before="80"/>
+        <w:jc w:val="center"/>
       </w:pPr>
+      <w:r>
+        <w:rPr>
+          <w:i/>
+          <w:iCs/>
+          <w:sz w:val="20"/>
+          <w:szCs w:val="20"/>
+        </w:rPr>
+        <w:t xml:space="preserve">Table 5.13. Fridge Ingredient Detection and Recipe Suggestions requirements</w:t>
+      </w:r>
     </w:p>
     <w:p>
       <w:pPr>
@@ -14869,8 +15321,18 @@
     </w:tbl>
     <w:p>
       <w:pPr>
-        <w:spacing w:after="120"/>
+        <w:spacing w:after="200" w:before="80"/>
+        <w:jc w:val="center"/>
       </w:pPr>
+      <w:r>
+        <w:rPr>
+          <w:i/>
+          <w:iCs/>
+          <w:sz w:val="20"/>
+          <w:szCs w:val="20"/>
+        </w:rPr>
+        <w:t xml:space="preserve">Table 5.14. Healthy Restaurant Map requirements</w:t>
+      </w:r>
     </w:p>
     <w:p>
       <w:pPr>
@@ -15314,8 +15776,18 @@
     </w:tbl>
     <w:p>
       <w:pPr>
-        <w:spacing w:after="120"/>
+        <w:spacing w:after="200" w:before="80"/>
+        <w:jc w:val="center"/>
       </w:pPr>
+      <w:r>
+        <w:rPr>
+          <w:i/>
+          <w:iCs/>
+          <w:sz w:val="20"/>
+          <w:szCs w:val="20"/>
+        </w:rPr>
+        <w:t xml:space="preserve">Table 5.15. Food Catalogue Administration requirements</w:t>
+      </w:r>
     </w:p>
     <w:p>
       <w:pPr>
@@ -16248,8 +16720,18 @@
     </w:tbl>
     <w:p>
       <w:pPr>
-        <w:spacing w:after="120"/>
+        <w:spacing w:after="200" w:before="80"/>
+        <w:jc w:val="center"/>
       </w:pPr>
+      <w:r>
+        <w:rPr>
+          <w:i/>
+          <w:iCs/>
+          <w:sz w:val="20"/>
+          <w:szCs w:val="20"/>
+        </w:rPr>
+        <w:t xml:space="preserve">Table 5.16. Machine Learning Development requirements</w:t>
+      </w:r>
     </w:p>
     <w:p>
       <w:pPr>
@@ -16268,7 +16750,7 @@
         <w:jc w:val="both"/>
       </w:pPr>
       <w:r>
-        <w:t xml:space="preserve">This section describes the main information that Zindeo stores. These entities will be the basis of the class diagrams in RSD Revision 2.0.</w:t>
+        <w:t xml:space="preserve">Table 6.1 describes the main information that Zindeo stores. These entities will be the basis of the class diagrams in RSD Revision 2.0.</w:t>
       </w:r>
     </w:p>
     <w:tbl>
@@ -18087,6 +18569,15 @@
         <w:t xml:space="preserve">8. Non-Functional Requirements</w:t>
       </w:r>
       <w:bookmarkEnd w:id="42"/>
+    </w:p>
+    <w:p>
+      <w:pPr>
+        <w:spacing w:after="120" w:line="288"/>
+        <w:jc w:val="both"/>
+      </w:pPr>
+      <w:r>
+        <w:t xml:space="preserve">The non-functional requirements are grouped by quality attribute in Tables 8.1–8.10, using the same priorities as in Section 5.</w:t>
+      </w:r>
     </w:p>
     <w:p>
       <w:pPr>
@@ -18530,8 +19021,18 @@
     </w:tbl>
     <w:p>
       <w:pPr>
-        <w:spacing w:after="120"/>
+        <w:spacing w:after="200" w:before="80"/>
+        <w:jc w:val="center"/>
       </w:pPr>
+      <w:r>
+        <w:rPr>
+          <w:i/>
+          <w:iCs/>
+          <w:sz w:val="20"/>
+          <w:szCs w:val="20"/>
+        </w:rPr>
+        <w:t xml:space="preserve">Table 8.1. Performance requirements</w:t>
+      </w:r>
     </w:p>
     <w:p>
       <w:pPr>
@@ -18975,8 +19476,18 @@
     </w:tbl>
     <w:p>
       <w:pPr>
-        <w:spacing w:after="120"/>
+        <w:spacing w:after="200" w:before="80"/>
+        <w:jc w:val="center"/>
       </w:pPr>
+      <w:r>
+        <w:rPr>
+          <w:i/>
+          <w:iCs/>
+          <w:sz w:val="20"/>
+          <w:szCs w:val="20"/>
+        </w:rPr>
+        <w:t xml:space="preserve">Table 8.2. Accuracy requirements</w:t>
+      </w:r>
     </w:p>
     <w:p>
       <w:pPr>
@@ -19260,8 +19771,18 @@
     </w:tbl>
     <w:p>
       <w:pPr>
-        <w:spacing w:after="120"/>
+        <w:spacing w:after="200" w:before="80"/>
+        <w:jc w:val="center"/>
       </w:pPr>
+      <w:r>
+        <w:rPr>
+          <w:i/>
+          <w:iCs/>
+          <w:sz w:val="20"/>
+          <w:szCs w:val="20"/>
+        </w:rPr>
+        <w:t xml:space="preserve">Table 8.3. Resource Usage on the Device requirements</w:t>
+      </w:r>
     </w:p>
     <w:p>
       <w:pPr>
@@ -19625,8 +20146,18 @@
     </w:tbl>
     <w:p>
       <w:pPr>
-        <w:spacing w:after="120"/>
+        <w:spacing w:after="200" w:before="80"/>
+        <w:jc w:val="center"/>
       </w:pPr>
+      <w:r>
+        <w:rPr>
+          <w:i/>
+          <w:iCs/>
+          <w:sz w:val="20"/>
+          <w:szCs w:val="20"/>
+        </w:rPr>
+        <w:t xml:space="preserve">Table 8.4. Usability and Accessibility requirements</w:t>
+      </w:r>
     </w:p>
     <w:p>
       <w:pPr>
@@ -19990,8 +20521,18 @@
     </w:tbl>
     <w:p>
       <w:pPr>
-        <w:spacing w:after="120"/>
+        <w:spacing w:after="200" w:before="80"/>
+        <w:jc w:val="center"/>
       </w:pPr>
+      <w:r>
+        <w:rPr>
+          <w:i/>
+          <w:iCs/>
+          <w:sz w:val="20"/>
+          <w:szCs w:val="20"/>
+        </w:rPr>
+        <w:t xml:space="preserve">Table 8.5. Reliability and Availability requirements</w:t>
+      </w:r>
     </w:p>
     <w:p>
       <w:pPr>
@@ -20595,8 +21136,18 @@
     </w:tbl>
     <w:p>
       <w:pPr>
-        <w:spacing w:after="120"/>
+        <w:spacing w:after="200" w:before="80"/>
+        <w:jc w:val="center"/>
       </w:pPr>
+      <w:r>
+        <w:rPr>
+          <w:i/>
+          <w:iCs/>
+          <w:sz w:val="20"/>
+          <w:szCs w:val="20"/>
+        </w:rPr>
+        <w:t xml:space="preserve">Table 8.6. Security requirements</w:t>
+      </w:r>
     </w:p>
     <w:p>
       <w:pPr>
@@ -21120,8 +21671,18 @@
     </w:tbl>
     <w:p>
       <w:pPr>
-        <w:spacing w:after="120"/>
+        <w:spacing w:after="200" w:before="80"/>
+        <w:jc w:val="center"/>
       </w:pPr>
+      <w:r>
+        <w:rPr>
+          <w:i/>
+          <w:iCs/>
+          <w:sz w:val="20"/>
+          <w:szCs w:val="20"/>
+        </w:rPr>
+        <w:t xml:space="preserve">Table 8.7. Privacy and Legal Compliance requirements</w:t>
+      </w:r>
     </w:p>
     <w:p>
       <w:pPr>
@@ -21485,8 +22046,18 @@
     </w:tbl>
     <w:p>
       <w:pPr>
-        <w:spacing w:after="120"/>
+        <w:spacing w:after="200" w:before="80"/>
+        <w:jc w:val="center"/>
       </w:pPr>
+      <w:r>
+        <w:rPr>
+          <w:i/>
+          <w:iCs/>
+          <w:sz w:val="20"/>
+          <w:szCs w:val="20"/>
+        </w:rPr>
+        <w:t xml:space="preserve">Table 8.8. Health, Safety and Ethics requirements</w:t>
+      </w:r>
     </w:p>
     <w:p>
       <w:pPr>
@@ -21930,8 +22501,18 @@
     </w:tbl>
     <w:p>
       <w:pPr>
-        <w:spacing w:after="120"/>
+        <w:spacing w:after="200" w:before="80"/>
+        <w:jc w:val="center"/>
       </w:pPr>
+      <w:r>
+        <w:rPr>
+          <w:i/>
+          <w:iCs/>
+          <w:sz w:val="20"/>
+          <w:szCs w:val="20"/>
+        </w:rPr>
+        <w:t xml:space="preserve">Table 8.9. Platform and Environment requirements</w:t>
+      </w:r>
     </w:p>
     <w:p>
       <w:pPr>
@@ -22375,8 +22956,18 @@
     </w:tbl>
     <w:p>
       <w:pPr>
-        <w:spacing w:after="120"/>
+        <w:spacing w:after="200" w:before="80"/>
+        <w:jc w:val="center"/>
       </w:pPr>
+      <w:r>
+        <w:rPr>
+          <w:i/>
+          <w:iCs/>
+          <w:sz w:val="20"/>
+          <w:szCs w:val="20"/>
+        </w:rPr>
+        <w:t xml:space="preserve">Table 8.10. Maintainability and Cost requirements</w:t>
+      </w:r>
     </w:p>
     <w:p>
       <w:pPr>
@@ -22622,6 +23213,15 @@
         <w:t xml:space="preserve">10. Glossary</w:t>
       </w:r>
       <w:bookmarkEnd w:id="56"/>
+    </w:p>
+    <w:p>
+      <w:pPr>
+        <w:spacing w:after="120" w:line="288"/>
+        <w:jc w:val="both"/>
+      </w:pPr>
+      <w:r>
+        <w:t xml:space="preserve">Table 10.1 defines the terms used in this document.</w:t>
+      </w:r>
     </w:p>
     <w:tbl>
       <w:tblPr>
@@ -23729,6 +24329,21 @@
         </w:tc>
       </w:tr>
     </w:tbl>
+    <w:p>
+      <w:pPr>
+        <w:spacing w:after="200" w:before="80"/>
+        <w:jc w:val="center"/>
+      </w:pPr>
+      <w:r>
+        <w:rPr>
+          <w:i/>
+          <w:iCs/>
+          <w:sz w:val="20"/>
+          <w:szCs w:val="20"/>
+        </w:rPr>
+        <w:t xml:space="preserve">Table 10.1. Glossary of terms</w:t>
+      </w:r>
+    </w:p>
     <w:p>
       <w:pPr>
         <w:pStyle w:val="Heading1"/>

</xml_diff>

<commit_message>
docs(course): fix RSD v1.0 review findings
- Cite [1] and [2] in Section 1.1
- Correct author initials of reference [4]
- Reword Sign in with Apple rationale (App Store guideline 4.8) in NFR-26 and PRD
- Require licence confirmation for re-uploaded public datasets (FR-16.1)

Co-Authored-By: Claude Opus 5.5 <noreply@anthropic.com>
</commit_message>
<xml_diff>
--- a/docs/moodle/ready-deliverables/Zindeo-RSD-1.0.docx
+++ b/docs/moodle/ready-deliverables/Zindeo-RSD-1.0.docx
@@ -1684,7 +1684,7 @@
         <w:jc w:val="both"/>
       </w:pPr>
       <w:r>
-        <w:t xml:space="preserve">This Requirements Specifications Document (RSD) refines the problem definition given in the Project Assignment Form (PAF) of Zindeo. Revision 1.0 describes the requirements in textual form: the problem, the existing systems, the current practice of calorie tracking, the actors, and the functional, data, behavioral and non-functional requirements of the system. Revision 2.0 will model the same requirements in UML (use case, activity, class and state diagrams). The requirement identifiers introduced in this document (e.g. FR-5.4, NFR-3) will be kept unchanged in later revisions so that every UML model element can be traced back to a requirement.</w:t>
+        <w:t xml:space="preserve">This Requirements Specifications Document (RSD) refines the problem definition given in the Project Assignment Form (PAF) of Zindeo. Revision 1.0 describes the requirements in textual form: the problem, the existing systems, the current practice of calorie tracking, the actors, and the functional, data, behavioral and non-functional requirements of the system. Revision 2.0 will model the same requirements in UML (use case, activity, class and state diagrams), following the object-oriented requirements modelling approach of [1] and the requirements engineering practices described in [2]. The requirement identifiers introduced in this document (e.g. FR-5.4, NFR-3) will be kept unchanged in later revisions so that every UML model element can be traced back to a requirement.</w:t>
       </w:r>
     </w:p>
     <w:p>
@@ -15966,7 +15966,7 @@
                 <w:sz w:val="20"/>
                 <w:szCs w:val="20"/>
               </w:rPr>
-              <w:t xml:space="preserve">The team shall build a labelled Turkish food image dataset covering at least 100 dishes, combining public datasets whose licences allow commercial use (e.g. TurkishFoods-25) with photos collected by the team and, with consent, by users. Datasets licensed for non-commercial research only shall be used for experiments only and shall not be used to train the product model.</w:t>
+              <w:t xml:space="preserve">The team shall build a labelled Turkish food image dataset covering at least 100 dishes, combining public datasets whose licences allow commercial use with photos collected by the team and, with consent, by users. Datasets licensed for non-commercial research only shall be used for experiments only and shall not be used to train the product model. The licence of each public dataset (e.g. TurkishFoods-25, whose public copy is a re-upload by a third party) shall be confirmed with its original authors before it is used for the product model.</w:t>
             </w:r>
           </w:p>
         </w:tc>
@@ -21557,7 +21557,7 @@
                 <w:sz w:val="20"/>
                 <w:szCs w:val="20"/>
               </w:rPr>
-              <w:t xml:space="preserve">The application shall comply with the App Store Review Guidelines [23] and Google Play policies, including Sign in with Apple, in-app account deletion and in-app purchase for digital content.</w:t>
+              <w:t xml:space="preserve">The application shall comply with the App Store Review Guidelines [23] and Google Play policies, including offering an equivalent privacy-focused login option alongside Google sign-in (Sign in with Apple, FR-1.1), in-app account deletion and in-app purchase for digital content.</w:t>
             </w:r>
           </w:p>
         </w:tc>
@@ -24444,7 +24444,7 @@
         <w:t xml:space="preserve">	</w:t>
       </w:r>
       <w:r>
-        <w:t xml:space="preserve">C. Güngör, F. Baltacı, A. Erdem and E. Erdem, “Turkish cuisine: A benchmark dataset with Turkish meals for food recognition,” in </w:t>
+        <w:t xml:space="preserve">C. Güngör, F. Baltacı, İ. A. Erdem and M. E. Erdem, “Turkish cuisine: A benchmark dataset with Turkish meals for food recognition,” in </w:t>
       </w:r>
       <w:r>
         <w:rPr>

</xml_diff>